<commit_message>
Created mot letter for IQVIA consultant position
</commit_message>
<xml_diff>
--- a/Motivation_letter_Healthcare consultant.docx
+++ b/Motivation_letter_Healthcare consultant.docx
@@ -132,25 +132,166 @@
         <w:t xml:space="preserve"> </w:t>
       </w:r>
       <w:r>
-        <w:t xml:space="preserve">I am thrilled about this opportunity to create and disseminate awareness on the dosing guidelines during pregnancies within </w:t>
-      </w:r>
-      <w:r>
-        <w:t xml:space="preserve">the </w:t>
-      </w:r>
-      <w:r>
-        <w:t>MADAM project</w:t>
+        <w:t>I am thrilled about this opportunity to</w:t>
+      </w:r>
+      <w:r>
+        <w:t xml:space="preserve"> </w:t>
+      </w:r>
+      <w:r>
+        <w:t xml:space="preserve">assist </w:t>
+      </w:r>
+      <w:r>
+        <w:t>pharmaceutical</w:t>
+      </w:r>
+      <w:r>
+        <w:t xml:space="preserve"> and</w:t>
+      </w:r>
+      <w:r>
+        <w:t xml:space="preserve"> </w:t>
+      </w:r>
+      <w:r>
+        <w:t>MedTech companie</w:t>
+      </w:r>
+      <w:r>
+        <w:t>s</w:t>
+      </w:r>
+      <w:r>
+        <w:t xml:space="preserve"> </w:t>
+      </w:r>
+      <w:r>
+        <w:t>and various other</w:t>
+      </w:r>
+      <w:r>
+        <w:t xml:space="preserve"> healthcare stakeholders</w:t>
+      </w:r>
+      <w:r>
+        <w:t xml:space="preserve"> </w:t>
+      </w:r>
+      <w:r>
+        <w:t>with</w:t>
+      </w:r>
+      <w:r>
+        <w:t xml:space="preserve"> </w:t>
+      </w:r>
+      <w:r>
+        <w:t>data</w:t>
+      </w:r>
+      <w:r>
+        <w:t xml:space="preserve"> analysis</w:t>
+      </w:r>
+      <w:r>
+        <w:t xml:space="preserve"> and </w:t>
+      </w:r>
+      <w:r>
+        <w:t>strategy development</w:t>
+      </w:r>
+      <w:r>
+        <w:rPr>
+          <w:lang w:val="en-NL"/>
+        </w:rPr>
+        <w:t>, contributing to a healthier future for society</w:t>
+      </w:r>
+      <w:r>
+        <w:t>.</w:t>
+      </w:r>
+    </w:p>
+    <w:p>
+      <w:pPr>
+        <w:jc w:val="both"/>
+        <w:rPr>
+          <w:highlight w:val="yellow"/>
+        </w:rPr>
+      </w:pPr>
+    </w:p>
+    <w:p>
+      <w:pPr>
+        <w:jc w:val="both"/>
+      </w:pPr>
+      <w:r>
+        <w:t xml:space="preserve">My academic background equips me with a solid foundation for this role. </w:t>
+      </w:r>
+      <w:r>
+        <w:t>Having finished</w:t>
+      </w:r>
+      <w:r>
+        <w:t xml:space="preserve"> a </w:t>
+      </w:r>
+      <w:proofErr w:type="gramStart"/>
+      <w:r>
+        <w:t>bachelor’s in Biology</w:t>
+      </w:r>
+      <w:proofErr w:type="gramEnd"/>
+      <w:r>
+        <w:t xml:space="preserve"> and </w:t>
+      </w:r>
+      <w:r>
+        <w:t xml:space="preserve">a master’s </w:t>
+      </w:r>
+      <w:r>
+        <w:t xml:space="preserve">in Medical Biology, I </w:t>
+      </w:r>
+      <w:r>
+        <w:t>gained extensive knowledge</w:t>
+      </w:r>
+      <w:r>
+        <w:t xml:space="preserve"> in the field and</w:t>
+      </w:r>
+      <w:r>
+        <w:t xml:space="preserve"> </w:t>
+      </w:r>
+      <w:r>
+        <w:t xml:space="preserve">developed a critical understanding of </w:t>
+      </w:r>
+      <w:r>
+        <w:t>different</w:t>
+      </w:r>
+      <w:r>
+        <w:t xml:space="preserve"> </w:t>
+      </w:r>
+      <w:r>
+        <w:t>medical technologies</w:t>
       </w:r>
       <w:r>
         <w:t>,</w:t>
       </w:r>
       <w:r>
-        <w:t xml:space="preserve"> contribut</w:t>
-      </w:r>
-      <w:r>
-        <w:t>ing</w:t>
-      </w:r>
-      <w:r>
-        <w:t xml:space="preserve"> to a healthier future for society.</w:t>
+        <w:t xml:space="preserve"> pharmaceuticals</w:t>
+      </w:r>
+      <w:r>
+        <w:t xml:space="preserve">, </w:t>
+      </w:r>
+      <w:r>
+        <w:t>and biomedical challenges</w:t>
+      </w:r>
+      <w:r>
+        <w:t xml:space="preserve">. During </w:t>
+      </w:r>
+      <w:r>
+        <w:t xml:space="preserve">the SMI track in </w:t>
+      </w:r>
+      <w:r>
+        <w:t xml:space="preserve">the second year of </w:t>
+      </w:r>
+      <w:r>
+        <w:t>my master’s</w:t>
+      </w:r>
+      <w:r>
+        <w:t>,</w:t>
+      </w:r>
+      <w:r>
+        <w:t xml:space="preserve"> I gained valuable insights into digital healthcare, health technology assessment (HTA), market research, business models, value propositions, and health economics</w:t>
+      </w:r>
+      <w:r>
+        <w:t xml:space="preserve">, </w:t>
+      </w:r>
+      <w:r>
+        <w:t>covering</w:t>
+      </w:r>
+      <w:r>
+        <w:t xml:space="preserve"> healthcare systems of </w:t>
+      </w:r>
+      <w:r>
+        <w:t>different countries such as the Netherlands, the US, the UK, Germany, etc.</w:t>
       </w:r>
     </w:p>
     <w:p>
@@ -165,416 +306,352 @@
       <w:pPr>
         <w:jc w:val="both"/>
         <w:rPr>
+          <w:lang w:val="en-NL"/>
+        </w:rPr>
+      </w:pPr>
+      <w:r>
+        <w:t xml:space="preserve">In addition to my academic qualifications, my professional experience will be an asset in the role of </w:t>
+      </w:r>
+      <w:r>
+        <w:t>Associate Healthcare Consultant</w:t>
+      </w:r>
+      <w:r>
+        <w:t>.</w:t>
+      </w:r>
+      <w:r>
+        <w:t xml:space="preserve"> </w:t>
+      </w:r>
+      <w:r>
+        <w:rPr>
+          <w:lang w:val="en-NL"/>
+        </w:rPr>
+        <w:t xml:space="preserve">As a Junior Research Assistant at the Faculty of Biology and an assistant at a Contract Research Organization, I gained substantial experience in writing academic papers, designing experiments, preparing clinical documentation, </w:t>
+      </w:r>
+      <w:r>
+        <w:rPr>
+          <w:lang w:val="en-NL"/>
+        </w:rPr>
+        <w:t xml:space="preserve">analysing data, </w:t>
+      </w:r>
+      <w:r>
+        <w:rPr>
+          <w:lang w:val="en-NL"/>
+        </w:rPr>
+        <w:t>and ensuring compliance with client requirements. Th</w:t>
+      </w:r>
+      <w:r>
+        <w:rPr>
+          <w:lang w:val="en-NL"/>
+        </w:rPr>
+        <w:t>ese</w:t>
+      </w:r>
+      <w:r>
+        <w:rPr>
+          <w:lang w:val="en-NL"/>
+        </w:rPr>
+        <w:t xml:space="preserve"> role</w:t>
+      </w:r>
+      <w:r>
+        <w:rPr>
+          <w:lang w:val="en-NL"/>
+        </w:rPr>
+        <w:t>s</w:t>
+      </w:r>
+      <w:r>
+        <w:rPr>
+          <w:lang w:val="en-NL"/>
+        </w:rPr>
+        <w:t xml:space="preserve"> deepened my understanding of the scientific</w:t>
+      </w:r>
+      <w:r>
+        <w:rPr>
+          <w:lang w:val="en-NL"/>
+        </w:rPr>
+        <w:t>,</w:t>
+      </w:r>
+      <w:r>
+        <w:rPr>
+          <w:lang w:val="en-NL"/>
+        </w:rPr>
+        <w:t xml:space="preserve"> healthcare</w:t>
+      </w:r>
+      <w:r>
+        <w:rPr>
+          <w:lang w:val="en-NL"/>
+        </w:rPr>
+        <w:t>,</w:t>
+      </w:r>
+      <w:r>
+        <w:rPr>
+          <w:lang w:val="en-NL"/>
+        </w:rPr>
+        <w:t xml:space="preserve"> </w:t>
+      </w:r>
+      <w:r>
+        <w:rPr>
+          <w:lang w:val="en-NL"/>
+        </w:rPr>
+        <w:t xml:space="preserve">and pharmaceutical </w:t>
+      </w:r>
+      <w:r>
+        <w:rPr>
+          <w:lang w:val="en-NL"/>
+        </w:rPr>
+        <w:t>landscapes as well as improved my managerial and interpersonal skills.</w:t>
+      </w:r>
+    </w:p>
+    <w:p>
+      <w:pPr>
+        <w:jc w:val="both"/>
+        <w:rPr>
+          <w:lang w:val="en-NL"/>
+        </w:rPr>
+      </w:pPr>
+    </w:p>
+    <w:p>
+      <w:pPr>
+        <w:jc w:val="both"/>
+        <w:rPr>
+          <w:lang w:val="en-NL"/>
+        </w:rPr>
+      </w:pPr>
+      <w:r>
+        <w:rPr>
+          <w:lang w:val="en-NL"/>
+        </w:rPr>
+        <w:t xml:space="preserve">Besides, </w:t>
+      </w:r>
+      <w:r>
+        <w:rPr>
+          <w:lang w:val="en-NL"/>
+        </w:rPr>
+        <w:t>m</w:t>
+      </w:r>
+      <w:r>
+        <w:rPr>
+          <w:lang w:val="en-NL"/>
+        </w:rPr>
+        <w:t>y master’s thesis at HAN University of Applied Sciences provided me with valuable experience in both qualitative and</w:t>
+      </w:r>
+      <w:r>
+        <w:rPr>
+          <w:lang w:val="en-NL"/>
+        </w:rPr>
+        <w:t xml:space="preserve"> </w:t>
+      </w:r>
+      <w:r>
+        <w:rPr>
+          <w:lang w:val="en-NL"/>
+        </w:rPr>
+        <w:t xml:space="preserve">quantitative methods </w:t>
+      </w:r>
+      <w:r>
+        <w:rPr>
+          <w:lang w:val="en-NL"/>
+        </w:rPr>
+        <w:t>of</w:t>
+      </w:r>
+      <w:r>
+        <w:rPr>
+          <w:lang w:val="en-NL"/>
+        </w:rPr>
+        <w:t xml:space="preserve"> social science research. </w:t>
+      </w:r>
+      <w:r>
+        <w:rPr>
+          <w:lang w:val="en-NL"/>
+        </w:rPr>
+        <w:t xml:space="preserve">Moreover, </w:t>
+      </w:r>
+      <w:r>
+        <w:rPr>
+          <w:lang w:val="en-NL"/>
+        </w:rPr>
+        <w:t xml:space="preserve">I needed to use Dutch </w:t>
+      </w:r>
+      <w:r>
+        <w:rPr>
+          <w:lang w:val="en-NL"/>
+        </w:rPr>
+        <w:t>to complete</w:t>
+      </w:r>
+      <w:r>
+        <w:rPr>
+          <w:lang w:val="en-NL"/>
+        </w:rPr>
+        <w:t xml:space="preserve"> some parts </w:t>
+      </w:r>
+      <w:r>
+        <w:rPr>
+          <w:lang w:val="en-NL"/>
+        </w:rPr>
+        <w:t>of the thesis</w:t>
+      </w:r>
+      <w:r>
+        <w:rPr>
+          <w:lang w:val="en-NL"/>
+        </w:rPr>
+        <w:t xml:space="preserve">, </w:t>
+      </w:r>
+      <w:r>
+        <w:rPr>
+          <w:lang w:val="en-NL"/>
+        </w:rPr>
+        <w:t xml:space="preserve">which </w:t>
+      </w:r>
+      <w:r>
+        <w:rPr>
+          <w:lang w:val="en-NL"/>
+        </w:rPr>
+        <w:t>motivated</w:t>
+      </w:r>
+      <w:r>
+        <w:rPr>
+          <w:lang w:val="en-NL"/>
+        </w:rPr>
+        <w:t xml:space="preserve"> me </w:t>
+      </w:r>
+      <w:r>
+        <w:rPr>
+          <w:lang w:val="en-NL"/>
+        </w:rPr>
+        <w:t>to start</w:t>
+      </w:r>
+      <w:r>
+        <w:rPr>
+          <w:lang w:val="en-NL"/>
+        </w:rPr>
+        <w:t xml:space="preserve"> </w:t>
+      </w:r>
+      <w:r>
+        <w:rPr>
+          <w:lang w:val="en-NL"/>
+        </w:rPr>
+        <w:t xml:space="preserve">actively </w:t>
+      </w:r>
+      <w:r>
+        <w:rPr>
+          <w:lang w:val="en-NL"/>
+        </w:rPr>
+        <w:t>learning</w:t>
+      </w:r>
+      <w:r>
+        <w:rPr>
+          <w:lang w:val="en-NL"/>
+        </w:rPr>
+        <w:t xml:space="preserve"> the language</w:t>
+      </w:r>
+      <w:r>
+        <w:rPr>
+          <w:lang w:val="en-NL"/>
+        </w:rPr>
+        <w:t xml:space="preserve"> since then</w:t>
+      </w:r>
+      <w:r>
+        <w:rPr>
+          <w:lang w:val="en-NL"/>
+        </w:rPr>
+        <w:t xml:space="preserve">, and I </w:t>
+      </w:r>
+      <w:r>
+        <w:rPr>
+          <w:lang w:val="en-NL"/>
+        </w:rPr>
+        <w:t>aim</w:t>
+      </w:r>
+      <w:r>
+        <w:rPr>
+          <w:lang w:val="en-NL"/>
+        </w:rPr>
+        <w:t xml:space="preserve"> to speak it </w:t>
+      </w:r>
+      <w:r>
+        <w:rPr>
+          <w:lang w:val="en-NL"/>
+        </w:rPr>
+        <w:t>freely (</w:t>
+      </w:r>
+      <w:r>
+        <w:rPr>
+          <w:lang w:val="en-NL"/>
+        </w:rPr>
+        <w:t>at the B2 level</w:t>
+      </w:r>
+      <w:r>
+        <w:rPr>
+          <w:lang w:val="en-NL"/>
+        </w:rPr>
+        <w:t xml:space="preserve"> at least)</w:t>
+      </w:r>
+      <w:r>
+        <w:rPr>
+          <w:lang w:val="en-NL"/>
+        </w:rPr>
+        <w:t xml:space="preserve"> within </w:t>
+      </w:r>
+      <w:r>
+        <w:rPr>
+          <w:lang w:val="en-NL"/>
+        </w:rPr>
+        <w:t xml:space="preserve">less than </w:t>
+      </w:r>
+      <w:r>
+        <w:rPr>
+          <w:lang w:val="en-NL"/>
+        </w:rPr>
+        <w:t>a year. Furthermore, during my SMI track, I had the opportunity to work on real-world projects such as “HTA of a Medical Guidance App for International Students in the NL” and “A Shared Ownership Model of the Green Corridor.” These experiences greatly enriched my understanding of stakeholder collaboration and honed my skills in presenting and engaging audiences effectively.</w:t>
+      </w:r>
+    </w:p>
+    <w:p>
+      <w:pPr>
+        <w:jc w:val="both"/>
+        <w:rPr>
           <w:highlight w:val="yellow"/>
         </w:rPr>
       </w:pPr>
-      <w:r>
+    </w:p>
+    <w:p>
+      <w:pPr>
+        <w:jc w:val="both"/>
+      </w:pPr>
+      <w:r>
+        <w:t>In summary,</w:t>
+      </w:r>
+      <w:r>
+        <w:t xml:space="preserve"> </w:t>
+      </w:r>
+      <w:r>
+        <w:t xml:space="preserve">my strong motivation for </w:t>
+      </w:r>
+      <w:r>
+        <w:t>connecting science and society</w:t>
+      </w:r>
+      <w:r>
+        <w:t xml:space="preserve">, combined with my comprehensive education and diverse professional experiences, positions me as a strong candidate for the </w:t>
+      </w:r>
+      <w:r>
+        <w:t>Associate Healthcare Consultant</w:t>
+      </w:r>
+      <w:r>
+        <w:t xml:space="preserve"> </w:t>
+      </w:r>
+      <w:r>
+        <w:t>role.</w:t>
+      </w:r>
+    </w:p>
+    <w:p>
+      <w:pPr>
+        <w:jc w:val="both"/>
         <w:rPr>
           <w:highlight w:val="yellow"/>
         </w:rPr>
-        <w:t xml:space="preserve">My academic background equips me with a solid foundation for this role. </w:t>
-      </w:r>
-      <w:r>
-        <w:rPr>
-          <w:highlight w:val="yellow"/>
-        </w:rPr>
-        <w:t>Having finished</w:t>
-      </w:r>
-      <w:r>
-        <w:rPr>
-          <w:highlight w:val="yellow"/>
-        </w:rPr>
-        <w:t xml:space="preserve"> a </w:t>
-      </w:r>
-      <w:proofErr w:type="gramStart"/>
-      <w:r>
-        <w:rPr>
-          <w:highlight w:val="yellow"/>
-        </w:rPr>
-        <w:t>bachelor’s in Biology</w:t>
-      </w:r>
-      <w:proofErr w:type="gramEnd"/>
-      <w:r>
-        <w:rPr>
-          <w:highlight w:val="yellow"/>
-        </w:rPr>
-        <w:t xml:space="preserve"> and </w:t>
-      </w:r>
-      <w:r>
-        <w:rPr>
-          <w:highlight w:val="yellow"/>
-        </w:rPr>
-        <w:t xml:space="preserve">a master’s </w:t>
-      </w:r>
-      <w:r>
-        <w:rPr>
-          <w:highlight w:val="yellow"/>
-        </w:rPr>
-        <w:t xml:space="preserve">in Medical Biology, I </w:t>
-      </w:r>
-      <w:r>
-        <w:rPr>
-          <w:highlight w:val="yellow"/>
-        </w:rPr>
-        <w:t>gained extensive knowledge</w:t>
-      </w:r>
-      <w:r>
-        <w:rPr>
-          <w:highlight w:val="yellow"/>
-        </w:rPr>
-        <w:t xml:space="preserve"> in the field and</w:t>
-      </w:r>
-      <w:r>
-        <w:rPr>
-          <w:highlight w:val="yellow"/>
-        </w:rPr>
-        <w:t xml:space="preserve"> </w:t>
-      </w:r>
-      <w:r>
-        <w:rPr>
-          <w:highlight w:val="yellow"/>
-        </w:rPr>
-        <w:t xml:space="preserve">developed a critical understanding of </w:t>
-      </w:r>
-      <w:r>
-        <w:rPr>
-          <w:highlight w:val="yellow"/>
-        </w:rPr>
-        <w:t xml:space="preserve">various </w:t>
-      </w:r>
-      <w:r>
-        <w:rPr>
-          <w:highlight w:val="yellow"/>
-        </w:rPr>
-        <w:t>medical technologies</w:t>
-      </w:r>
-      <w:r>
-        <w:rPr>
-          <w:highlight w:val="yellow"/>
-        </w:rPr>
-        <w:t xml:space="preserve"> and pharmaceuticals</w:t>
-      </w:r>
-      <w:r>
-        <w:rPr>
-          <w:highlight w:val="yellow"/>
-        </w:rPr>
-        <w:t>, including pharmacokinetics</w:t>
-      </w:r>
-      <w:r>
-        <w:rPr>
-          <w:highlight w:val="yellow"/>
-        </w:rPr>
-        <w:t xml:space="preserve"> and pharmacology</w:t>
-      </w:r>
-      <w:r>
-        <w:rPr>
-          <w:highlight w:val="yellow"/>
-        </w:rPr>
-        <w:t xml:space="preserve">. During </w:t>
-      </w:r>
-      <w:r>
-        <w:rPr>
-          <w:highlight w:val="yellow"/>
-        </w:rPr>
-        <w:t xml:space="preserve">the SMI track in </w:t>
-      </w:r>
-      <w:r>
-        <w:rPr>
-          <w:highlight w:val="yellow"/>
-        </w:rPr>
-        <w:t xml:space="preserve">the second year of </w:t>
-      </w:r>
-      <w:r>
-        <w:rPr>
-          <w:highlight w:val="yellow"/>
-        </w:rPr>
-        <w:t>my master’s</w:t>
-      </w:r>
-      <w:r>
-        <w:rPr>
-          <w:highlight w:val="yellow"/>
-        </w:rPr>
-        <w:t>,</w:t>
-      </w:r>
-      <w:r>
-        <w:rPr>
-          <w:highlight w:val="yellow"/>
-        </w:rPr>
-        <w:t xml:space="preserve"> I gained valuable insights into digital healthcare, health technology assessment (HTA), market research, business models, value propositions, and health economics</w:t>
-      </w:r>
-      <w:r>
-        <w:rPr>
-          <w:highlight w:val="yellow"/>
-        </w:rPr>
-        <w:t xml:space="preserve">, </w:t>
-      </w:r>
-      <w:r>
-        <w:rPr>
-          <w:highlight w:val="yellow"/>
-        </w:rPr>
-        <w:t>covering</w:t>
-      </w:r>
-      <w:r>
-        <w:rPr>
-          <w:highlight w:val="yellow"/>
-        </w:rPr>
-        <w:t xml:space="preserve"> healthcare systems of </w:t>
-      </w:r>
-      <w:r>
-        <w:rPr>
-          <w:highlight w:val="yellow"/>
-        </w:rPr>
-        <w:t>different countries such as the Netherlands, the US, the UK, Germany, etc.</w:t>
-      </w:r>
-    </w:p>
-    <w:p>
-      <w:pPr>
-        <w:jc w:val="both"/>
-        <w:rPr>
-          <w:highlight w:val="yellow"/>
-        </w:rPr>
-      </w:pPr>
-    </w:p>
-    <w:p>
-      <w:pPr>
-        <w:jc w:val="both"/>
-        <w:rPr>
-          <w:highlight w:val="yellow"/>
-        </w:rPr>
-      </w:pPr>
-      <w:r>
-        <w:rPr>
-          <w:highlight w:val="yellow"/>
-        </w:rPr>
-        <w:t xml:space="preserve">In addition to my academic qualifications, my professional experience will be an asset in the role of </w:t>
-      </w:r>
-      <w:r>
-        <w:rPr>
-          <w:highlight w:val="yellow"/>
-        </w:rPr>
-        <w:t>Science Communication Specialist</w:t>
-      </w:r>
-      <w:r>
-        <w:rPr>
-          <w:highlight w:val="yellow"/>
-        </w:rPr>
-        <w:t xml:space="preserve">. As an assistant at a Contract Research Organization, I developed clinical trial documentation, conducted pharmaceutical user interviews, and ensured compliance with client requirements across </w:t>
-      </w:r>
-      <w:r>
-        <w:rPr>
-          <w:highlight w:val="yellow"/>
-        </w:rPr>
-        <w:t>different</w:t>
-      </w:r>
-      <w:r>
-        <w:rPr>
-          <w:highlight w:val="yellow"/>
-        </w:rPr>
-        <w:t xml:space="preserve"> projects. This experience provided me with a deep understanding of the MedTech and pharmaceutical industries, as well as </w:t>
-      </w:r>
-      <w:r>
-        <w:rPr>
-          <w:highlight w:val="yellow"/>
-        </w:rPr>
-        <w:t>improved</w:t>
-      </w:r>
-      <w:r>
-        <w:rPr>
-          <w:highlight w:val="yellow"/>
-        </w:rPr>
-        <w:t xml:space="preserve"> my managerial and interpersonal skills. Furthermore, during my SMI track, I collaborated with fellow students</w:t>
-      </w:r>
-      <w:r>
-        <w:rPr>
-          <w:highlight w:val="yellow"/>
-        </w:rPr>
-        <w:t xml:space="preserve"> and </w:t>
-      </w:r>
-      <w:r>
-        <w:rPr>
-          <w:highlight w:val="yellow"/>
-        </w:rPr>
-        <w:t xml:space="preserve">organizations in Nijmegen (including </w:t>
-      </w:r>
-      <w:r>
-        <w:rPr>
-          <w:highlight w:val="yellow"/>
-        </w:rPr>
-        <w:t xml:space="preserve">the </w:t>
-      </w:r>
-      <w:r>
-        <w:rPr>
-          <w:highlight w:val="yellow"/>
-        </w:rPr>
-        <w:t>municipality of Nijmegen)</w:t>
-      </w:r>
-      <w:r>
-        <w:rPr>
-          <w:highlight w:val="yellow"/>
-        </w:rPr>
-        <w:t xml:space="preserve"> on real-life projects</w:t>
-      </w:r>
-      <w:r>
-        <w:rPr>
-          <w:highlight w:val="yellow"/>
-        </w:rPr>
-        <w:t xml:space="preserve"> such as </w:t>
-      </w:r>
-      <w:r>
-        <w:rPr>
-          <w:highlight w:val="yellow"/>
-        </w:rPr>
-        <w:t xml:space="preserve">“HTA of a Medical Guidance App for International Students in the NL” and “A Shared Ownership Model of the Green Corridor.” My master’s thesis at HAN University of Applied Sciences </w:t>
-      </w:r>
-      <w:r>
-        <w:rPr>
-          <w:highlight w:val="yellow"/>
-        </w:rPr>
-        <w:t>on the added</w:t>
-      </w:r>
-      <w:r>
-        <w:rPr>
-          <w:highlight w:val="yellow"/>
-        </w:rPr>
-        <w:t xml:space="preserve"> value of home telemonitoring technology</w:t>
-      </w:r>
-      <w:r>
-        <w:rPr>
-          <w:highlight w:val="yellow"/>
-        </w:rPr>
-        <w:t xml:space="preserve"> enriched my experience in HTA and stakeholder collaboration</w:t>
-      </w:r>
-      <w:r>
-        <w:rPr>
-          <w:highlight w:val="yellow"/>
-        </w:rPr>
-        <w:t xml:space="preserve"> even further</w:t>
-      </w:r>
-      <w:r>
-        <w:rPr>
-          <w:highlight w:val="yellow"/>
-        </w:rPr>
-        <w:t>.</w:t>
-      </w:r>
-    </w:p>
-    <w:p>
-      <w:pPr>
-        <w:jc w:val="both"/>
-        <w:rPr>
-          <w:highlight w:val="yellow"/>
-        </w:rPr>
-      </w:pPr>
-    </w:p>
-    <w:p>
-      <w:pPr>
-        <w:jc w:val="both"/>
-        <w:rPr>
-          <w:highlight w:val="yellow"/>
-        </w:rPr>
-      </w:pPr>
-      <w:r>
-        <w:rPr>
-          <w:highlight w:val="yellow"/>
-        </w:rPr>
-        <w:t>In summary,</w:t>
-      </w:r>
-      <w:r>
-        <w:rPr>
-          <w:highlight w:val="yellow"/>
-        </w:rPr>
-        <w:t xml:space="preserve"> </w:t>
-      </w:r>
-      <w:r>
-        <w:rPr>
-          <w:highlight w:val="yellow"/>
-        </w:rPr>
-        <w:t xml:space="preserve">my strong motivation for </w:t>
-      </w:r>
-      <w:r>
-        <w:rPr>
-          <w:highlight w:val="yellow"/>
-        </w:rPr>
-        <w:t>connecting science and society</w:t>
-      </w:r>
-      <w:r>
-        <w:rPr>
-          <w:highlight w:val="yellow"/>
-        </w:rPr>
-        <w:t xml:space="preserve">, combined with my comprehensive education and diverse professional experiences, positions me as a strong candidate for the </w:t>
-      </w:r>
-      <w:r>
-        <w:rPr>
-          <w:highlight w:val="yellow"/>
-        </w:rPr>
-        <w:t xml:space="preserve">Science Communication Specialist </w:t>
-      </w:r>
-      <w:r>
-        <w:rPr>
-          <w:highlight w:val="yellow"/>
-        </w:rPr>
-        <w:t>role.</w:t>
-      </w:r>
-    </w:p>
-    <w:p>
-      <w:pPr>
-        <w:jc w:val="both"/>
-        <w:rPr>
-          <w:highlight w:val="yellow"/>
-        </w:rPr>
-      </w:pPr>
-    </w:p>
-    <w:p>
-      <w:pPr>
-        <w:jc w:val="both"/>
-        <w:rPr>
-          <w:highlight w:val="yellow"/>
-        </w:rPr>
-      </w:pPr>
-      <w:r>
-        <w:rPr>
-          <w:highlight w:val="yellow"/>
-        </w:rPr>
-        <w:t xml:space="preserve">I would like to inform you that I hold Russian nationality; however, my orientation year visa </w:t>
-      </w:r>
-      <w:r>
-        <w:rPr>
-          <w:highlight w:val="yellow"/>
-        </w:rPr>
-        <w:t>would allow</w:t>
-      </w:r>
-      <w:r>
-        <w:rPr>
-          <w:highlight w:val="yellow"/>
-        </w:rPr>
-        <w:t xml:space="preserve"> me to work in the Netherlands without </w:t>
-      </w:r>
-      <w:r>
-        <w:rPr>
-          <w:highlight w:val="yellow"/>
-        </w:rPr>
-        <w:t xml:space="preserve">any </w:t>
-      </w:r>
-      <w:r>
-        <w:rPr>
-          <w:highlight w:val="yellow"/>
-        </w:rPr>
-        <w:t>restrictions until November 4, 2025. After this date, I will require a work permit to continue my employment.</w:t>
-      </w:r>
-    </w:p>
-    <w:p>
-      <w:pPr>
-        <w:jc w:val="both"/>
-      </w:pPr>
-      <w:r>
-        <w:rPr>
-          <w:highlight w:val="yellow"/>
-        </w:rPr>
-        <w:br/>
-      </w:r>
-      <w:r>
-        <w:rPr>
-          <w:highlight w:val="yellow"/>
-        </w:rPr>
+      </w:pPr>
+    </w:p>
+    <w:p>
+      <w:pPr>
+        <w:jc w:val="both"/>
+      </w:pPr>
+      <w:r>
         <w:t>Thank you for considering my application. Please feel free to reach out if you have any questions.</w:t>
       </w:r>
     </w:p>

</xml_diff>